<commit_message>
Feat:Implementação da tabela Regras de negocios
</commit_message>
<xml_diff>
--- a/Documentação/Escopo.docx
+++ b/Documentação/Escopo.docx
@@ -689,7 +689,8 @@
     </w:p>
     <w:tbl>
       <w:tblPr>
-        <w:tblW w:w="9160" w:type="dxa"/>
+        <w:tblW w:w="8556" w:type="dxa"/>
+        <w:tblInd w:w="-10" w:type="dxa"/>
         <w:tblCellMar>
           <w:left w:w="70" w:type="dxa"/>
           <w:right w:w="70" w:type="dxa"/>
@@ -697,23 +698,23 @@
         <w:tblLook w:val="04A0" w:firstRow="1" w:lastRow="0" w:firstColumn="1" w:lastColumn="0" w:noHBand="0" w:noVBand="1"/>
       </w:tblPr>
       <w:tblGrid>
-        <w:gridCol w:w="1474"/>
-        <w:gridCol w:w="6212"/>
-        <w:gridCol w:w="1474"/>
+        <w:gridCol w:w="1594"/>
+        <w:gridCol w:w="5368"/>
+        <w:gridCol w:w="1594"/>
       </w:tblGrid>
       <w:tr>
         <w:trPr>
-          <w:trHeight w:val="312"/>
+          <w:trHeight w:val="324"/>
         </w:trPr>
         <w:tc>
           <w:tcPr>
-            <w:tcW w:w="9160" w:type="dxa"/>
+            <w:tcW w:w="8556" w:type="dxa"/>
             <w:gridSpan w:val="3"/>
             <w:tcBorders>
-              <w:top w:val="single" w:sz="4" w:space="0" w:color="auto"/>
-              <w:left w:val="single" w:sz="4" w:space="0" w:color="auto"/>
-              <w:bottom w:val="single" w:sz="4" w:space="0" w:color="auto"/>
-              <w:right w:val="single" w:sz="4" w:space="0" w:color="auto"/>
+              <w:top w:val="single" w:sz="8" w:space="0" w:color="auto"/>
+              <w:left w:val="single" w:sz="8" w:space="0" w:color="auto"/>
+              <w:bottom w:val="single" w:sz="8" w:space="0" w:color="auto"/>
+              <w:right w:val="single" w:sz="8" w:space="0" w:color="000000"/>
             </w:tcBorders>
             <w:shd w:val="clear" w:color="000000" w:fill="B4C6E7"/>
             <w:vAlign w:val="center"/>
@@ -750,16 +751,16 @@
       </w:tr>
       <w:tr>
         <w:trPr>
-          <w:trHeight w:val="312"/>
+          <w:trHeight w:val="324"/>
         </w:trPr>
         <w:tc>
           <w:tcPr>
-            <w:tcW w:w="1420" w:type="dxa"/>
-            <w:tcBorders>
-              <w:top w:val="nil"/>
-              <w:left w:val="single" w:sz="4" w:space="0" w:color="auto"/>
-              <w:bottom w:val="single" w:sz="4" w:space="0" w:color="auto"/>
-              <w:right w:val="single" w:sz="4" w:space="0" w:color="auto"/>
+            <w:tcW w:w="1594" w:type="dxa"/>
+            <w:tcBorders>
+              <w:top w:val="nil"/>
+              <w:left w:val="single" w:sz="8" w:space="0" w:color="auto"/>
+              <w:bottom w:val="single" w:sz="8" w:space="0" w:color="auto"/>
+              <w:right w:val="single" w:sz="8" w:space="0" w:color="auto"/>
             </w:tcBorders>
             <w:shd w:val="clear" w:color="000000" w:fill="D9E2F3"/>
             <w:vAlign w:val="center"/>
@@ -795,12 +796,12 @@
         </w:tc>
         <w:tc>
           <w:tcPr>
-            <w:tcW w:w="6300" w:type="dxa"/>
-            <w:tcBorders>
-              <w:top w:val="nil"/>
-              <w:left w:val="nil"/>
-              <w:bottom w:val="single" w:sz="4" w:space="0" w:color="auto"/>
-              <w:right w:val="single" w:sz="4" w:space="0" w:color="auto"/>
+            <w:tcW w:w="5368" w:type="dxa"/>
+            <w:tcBorders>
+              <w:top w:val="nil"/>
+              <w:left w:val="nil"/>
+              <w:bottom w:val="single" w:sz="8" w:space="0" w:color="auto"/>
+              <w:right w:val="single" w:sz="8" w:space="0" w:color="auto"/>
             </w:tcBorders>
             <w:shd w:val="clear" w:color="000000" w:fill="D9E2F3"/>
             <w:vAlign w:val="center"/>
@@ -836,12 +837,12 @@
         </w:tc>
         <w:tc>
           <w:tcPr>
-            <w:tcW w:w="1440" w:type="dxa"/>
-            <w:tcBorders>
-              <w:top w:val="nil"/>
-              <w:left w:val="nil"/>
-              <w:bottom w:val="single" w:sz="4" w:space="0" w:color="auto"/>
-              <w:right w:val="single" w:sz="4" w:space="0" w:color="auto"/>
+            <w:tcW w:w="1594" w:type="dxa"/>
+            <w:tcBorders>
+              <w:top w:val="nil"/>
+              <w:left w:val="nil"/>
+              <w:bottom w:val="single" w:sz="8" w:space="0" w:color="auto"/>
+              <w:right w:val="single" w:sz="8" w:space="0" w:color="auto"/>
             </w:tcBorders>
             <w:shd w:val="clear" w:color="000000" w:fill="D9E2F3"/>
             <w:vAlign w:val="center"/>
@@ -878,16 +879,16 @@
       </w:tr>
       <w:tr>
         <w:trPr>
-          <w:trHeight w:val="1044"/>
+          <w:trHeight w:val="1320"/>
         </w:trPr>
         <w:tc>
           <w:tcPr>
-            <w:tcW w:w="1420" w:type="dxa"/>
-            <w:tcBorders>
-              <w:top w:val="nil"/>
-              <w:left w:val="single" w:sz="4" w:space="0" w:color="auto"/>
-              <w:bottom w:val="single" w:sz="4" w:space="0" w:color="auto"/>
-              <w:right w:val="single" w:sz="4" w:space="0" w:color="auto"/>
+            <w:tcW w:w="1594" w:type="dxa"/>
+            <w:tcBorders>
+              <w:top w:val="nil"/>
+              <w:left w:val="single" w:sz="8" w:space="0" w:color="auto"/>
+              <w:bottom w:val="single" w:sz="8" w:space="0" w:color="auto"/>
+              <w:right w:val="single" w:sz="8" w:space="0" w:color="auto"/>
             </w:tcBorders>
             <w:shd w:val="clear" w:color="auto" w:fill="auto"/>
             <w:vAlign w:val="center"/>
@@ -923,12 +924,12 @@
         </w:tc>
         <w:tc>
           <w:tcPr>
-            <w:tcW w:w="6300" w:type="dxa"/>
-            <w:tcBorders>
-              <w:top w:val="nil"/>
-              <w:left w:val="nil"/>
-              <w:bottom w:val="single" w:sz="4" w:space="0" w:color="auto"/>
-              <w:right w:val="single" w:sz="4" w:space="0" w:color="auto"/>
+            <w:tcW w:w="5368" w:type="dxa"/>
+            <w:tcBorders>
+              <w:top w:val="nil"/>
+              <w:left w:val="nil"/>
+              <w:bottom w:val="single" w:sz="8" w:space="0" w:color="auto"/>
+              <w:right w:val="single" w:sz="8" w:space="0" w:color="auto"/>
             </w:tcBorders>
             <w:shd w:val="clear" w:color="auto" w:fill="auto"/>
             <w:vAlign w:val="center"/>
@@ -960,12 +961,12 @@
         </w:tc>
         <w:tc>
           <w:tcPr>
-            <w:tcW w:w="1440" w:type="dxa"/>
-            <w:tcBorders>
-              <w:top w:val="nil"/>
-              <w:left w:val="nil"/>
-              <w:bottom w:val="single" w:sz="4" w:space="0" w:color="auto"/>
-              <w:right w:val="single" w:sz="4" w:space="0" w:color="auto"/>
+            <w:tcW w:w="1594" w:type="dxa"/>
+            <w:tcBorders>
+              <w:top w:val="nil"/>
+              <w:left w:val="nil"/>
+              <w:bottom w:val="single" w:sz="8" w:space="0" w:color="auto"/>
+              <w:right w:val="single" w:sz="8" w:space="0" w:color="auto"/>
             </w:tcBorders>
             <w:shd w:val="clear" w:color="auto" w:fill="auto"/>
             <w:vAlign w:val="center"/>
@@ -1002,16 +1003,16 @@
       </w:tr>
       <w:tr>
         <w:trPr>
-          <w:trHeight w:val="1044"/>
+          <w:trHeight w:val="1320"/>
         </w:trPr>
         <w:tc>
           <w:tcPr>
-            <w:tcW w:w="1420" w:type="dxa"/>
-            <w:tcBorders>
-              <w:top w:val="nil"/>
-              <w:left w:val="single" w:sz="4" w:space="0" w:color="auto"/>
-              <w:bottom w:val="single" w:sz="4" w:space="0" w:color="auto"/>
-              <w:right w:val="single" w:sz="4" w:space="0" w:color="auto"/>
+            <w:tcW w:w="1594" w:type="dxa"/>
+            <w:tcBorders>
+              <w:top w:val="nil"/>
+              <w:left w:val="single" w:sz="8" w:space="0" w:color="auto"/>
+              <w:bottom w:val="single" w:sz="8" w:space="0" w:color="auto"/>
+              <w:right w:val="single" w:sz="8" w:space="0" w:color="auto"/>
             </w:tcBorders>
             <w:shd w:val="clear" w:color="auto" w:fill="auto"/>
             <w:vAlign w:val="center"/>
@@ -1047,12 +1048,12 @@
         </w:tc>
         <w:tc>
           <w:tcPr>
-            <w:tcW w:w="6300" w:type="dxa"/>
-            <w:tcBorders>
-              <w:top w:val="nil"/>
-              <w:left w:val="nil"/>
-              <w:bottom w:val="single" w:sz="4" w:space="0" w:color="auto"/>
-              <w:right w:val="single" w:sz="4" w:space="0" w:color="auto"/>
+            <w:tcW w:w="5368" w:type="dxa"/>
+            <w:tcBorders>
+              <w:top w:val="nil"/>
+              <w:left w:val="nil"/>
+              <w:bottom w:val="single" w:sz="8" w:space="0" w:color="auto"/>
+              <w:right w:val="single" w:sz="8" w:space="0" w:color="auto"/>
             </w:tcBorders>
             <w:shd w:val="clear" w:color="auto" w:fill="auto"/>
             <w:vAlign w:val="center"/>
@@ -1084,12 +1085,12 @@
         </w:tc>
         <w:tc>
           <w:tcPr>
-            <w:tcW w:w="1440" w:type="dxa"/>
-            <w:tcBorders>
-              <w:top w:val="nil"/>
-              <w:left w:val="nil"/>
-              <w:bottom w:val="single" w:sz="4" w:space="0" w:color="auto"/>
-              <w:right w:val="single" w:sz="4" w:space="0" w:color="auto"/>
+            <w:tcW w:w="1594" w:type="dxa"/>
+            <w:tcBorders>
+              <w:top w:val="nil"/>
+              <w:left w:val="nil"/>
+              <w:bottom w:val="single" w:sz="8" w:space="0" w:color="auto"/>
+              <w:right w:val="single" w:sz="8" w:space="0" w:color="auto"/>
             </w:tcBorders>
             <w:shd w:val="clear" w:color="auto" w:fill="auto"/>
             <w:vAlign w:val="center"/>
@@ -1126,16 +1127,16 @@
       </w:tr>
       <w:tr>
         <w:trPr>
-          <w:trHeight w:val="1044"/>
+          <w:trHeight w:val="1320"/>
         </w:trPr>
         <w:tc>
           <w:tcPr>
-            <w:tcW w:w="1420" w:type="dxa"/>
-            <w:tcBorders>
-              <w:top w:val="nil"/>
-              <w:left w:val="single" w:sz="4" w:space="0" w:color="auto"/>
-              <w:bottom w:val="single" w:sz="4" w:space="0" w:color="auto"/>
-              <w:right w:val="single" w:sz="4" w:space="0" w:color="auto"/>
+            <w:tcW w:w="1594" w:type="dxa"/>
+            <w:tcBorders>
+              <w:top w:val="nil"/>
+              <w:left w:val="single" w:sz="8" w:space="0" w:color="auto"/>
+              <w:bottom w:val="single" w:sz="8" w:space="0" w:color="auto"/>
+              <w:right w:val="single" w:sz="8" w:space="0" w:color="auto"/>
             </w:tcBorders>
             <w:shd w:val="clear" w:color="auto" w:fill="auto"/>
             <w:vAlign w:val="center"/>
@@ -1171,12 +1172,12 @@
         </w:tc>
         <w:tc>
           <w:tcPr>
-            <w:tcW w:w="6300" w:type="dxa"/>
-            <w:tcBorders>
-              <w:top w:val="nil"/>
-              <w:left w:val="nil"/>
-              <w:bottom w:val="single" w:sz="4" w:space="0" w:color="auto"/>
-              <w:right w:val="single" w:sz="4" w:space="0" w:color="auto"/>
+            <w:tcW w:w="5368" w:type="dxa"/>
+            <w:tcBorders>
+              <w:top w:val="nil"/>
+              <w:left w:val="nil"/>
+              <w:bottom w:val="single" w:sz="8" w:space="0" w:color="auto"/>
+              <w:right w:val="single" w:sz="8" w:space="0" w:color="auto"/>
             </w:tcBorders>
             <w:shd w:val="clear" w:color="auto" w:fill="auto"/>
             <w:vAlign w:val="center"/>
@@ -1208,12 +1209,12 @@
         </w:tc>
         <w:tc>
           <w:tcPr>
-            <w:tcW w:w="1440" w:type="dxa"/>
-            <w:tcBorders>
-              <w:top w:val="nil"/>
-              <w:left w:val="nil"/>
-              <w:bottom w:val="single" w:sz="4" w:space="0" w:color="auto"/>
-              <w:right w:val="single" w:sz="4" w:space="0" w:color="auto"/>
+            <w:tcW w:w="1594" w:type="dxa"/>
+            <w:tcBorders>
+              <w:top w:val="nil"/>
+              <w:left w:val="nil"/>
+              <w:bottom w:val="single" w:sz="8" w:space="0" w:color="auto"/>
+              <w:right w:val="single" w:sz="8" w:space="0" w:color="auto"/>
             </w:tcBorders>
             <w:shd w:val="clear" w:color="auto" w:fill="auto"/>
             <w:vAlign w:val="center"/>
@@ -1250,16 +1251,16 @@
       </w:tr>
       <w:tr>
         <w:trPr>
-          <w:trHeight w:val="1044"/>
+          <w:trHeight w:val="1320"/>
         </w:trPr>
         <w:tc>
           <w:tcPr>
-            <w:tcW w:w="1420" w:type="dxa"/>
-            <w:tcBorders>
-              <w:top w:val="nil"/>
-              <w:left w:val="single" w:sz="4" w:space="0" w:color="auto"/>
-              <w:bottom w:val="single" w:sz="4" w:space="0" w:color="auto"/>
-              <w:right w:val="single" w:sz="4" w:space="0" w:color="auto"/>
+            <w:tcW w:w="1594" w:type="dxa"/>
+            <w:tcBorders>
+              <w:top w:val="nil"/>
+              <w:left w:val="single" w:sz="8" w:space="0" w:color="auto"/>
+              <w:bottom w:val="single" w:sz="8" w:space="0" w:color="auto"/>
+              <w:right w:val="single" w:sz="8" w:space="0" w:color="auto"/>
             </w:tcBorders>
             <w:shd w:val="clear" w:color="auto" w:fill="auto"/>
             <w:vAlign w:val="center"/>
@@ -1289,18 +1290,19 @@
                 <w:szCs w:val="24"/>
                 <w:lang w:eastAsia="pt-BR"/>
               </w:rPr>
+              <w:lastRenderedPageBreak/>
               <w:t>RF 04</w:t>
             </w:r>
           </w:p>
         </w:tc>
         <w:tc>
           <w:tcPr>
-            <w:tcW w:w="6300" w:type="dxa"/>
-            <w:tcBorders>
-              <w:top w:val="nil"/>
-              <w:left w:val="nil"/>
-              <w:bottom w:val="single" w:sz="4" w:space="0" w:color="auto"/>
-              <w:right w:val="single" w:sz="4" w:space="0" w:color="auto"/>
+            <w:tcW w:w="5368" w:type="dxa"/>
+            <w:tcBorders>
+              <w:top w:val="nil"/>
+              <w:left w:val="nil"/>
+              <w:bottom w:val="single" w:sz="8" w:space="0" w:color="auto"/>
+              <w:right w:val="single" w:sz="8" w:space="0" w:color="auto"/>
             </w:tcBorders>
             <w:shd w:val="clear" w:color="auto" w:fill="auto"/>
             <w:vAlign w:val="center"/>
@@ -1332,12 +1334,12 @@
         </w:tc>
         <w:tc>
           <w:tcPr>
-            <w:tcW w:w="1440" w:type="dxa"/>
-            <w:tcBorders>
-              <w:top w:val="nil"/>
-              <w:left w:val="nil"/>
-              <w:bottom w:val="single" w:sz="4" w:space="0" w:color="auto"/>
-              <w:right w:val="single" w:sz="4" w:space="0" w:color="auto"/>
+            <w:tcW w:w="1594" w:type="dxa"/>
+            <w:tcBorders>
+              <w:top w:val="nil"/>
+              <w:left w:val="nil"/>
+              <w:bottom w:val="single" w:sz="8" w:space="0" w:color="auto"/>
+              <w:right w:val="single" w:sz="8" w:space="0" w:color="auto"/>
             </w:tcBorders>
             <w:shd w:val="clear" w:color="auto" w:fill="auto"/>
             <w:vAlign w:val="center"/>
@@ -1374,16 +1376,16 @@
       </w:tr>
       <w:tr>
         <w:trPr>
-          <w:trHeight w:val="1044"/>
+          <w:trHeight w:val="1320"/>
         </w:trPr>
         <w:tc>
           <w:tcPr>
-            <w:tcW w:w="1420" w:type="dxa"/>
-            <w:tcBorders>
-              <w:top w:val="nil"/>
-              <w:left w:val="single" w:sz="4" w:space="0" w:color="auto"/>
-              <w:bottom w:val="single" w:sz="4" w:space="0" w:color="auto"/>
-              <w:right w:val="single" w:sz="4" w:space="0" w:color="auto"/>
+            <w:tcW w:w="1594" w:type="dxa"/>
+            <w:tcBorders>
+              <w:top w:val="nil"/>
+              <w:left w:val="single" w:sz="8" w:space="0" w:color="auto"/>
+              <w:bottom w:val="single" w:sz="8" w:space="0" w:color="auto"/>
+              <w:right w:val="single" w:sz="8" w:space="0" w:color="auto"/>
             </w:tcBorders>
             <w:shd w:val="clear" w:color="auto" w:fill="auto"/>
             <w:vAlign w:val="center"/>
@@ -1413,19 +1415,18 @@
                 <w:szCs w:val="24"/>
                 <w:lang w:eastAsia="pt-BR"/>
               </w:rPr>
-              <w:lastRenderedPageBreak/>
               <w:t>RF 05</w:t>
             </w:r>
           </w:p>
         </w:tc>
         <w:tc>
           <w:tcPr>
-            <w:tcW w:w="6300" w:type="dxa"/>
-            <w:tcBorders>
-              <w:top w:val="nil"/>
-              <w:left w:val="nil"/>
-              <w:bottom w:val="single" w:sz="4" w:space="0" w:color="auto"/>
-              <w:right w:val="single" w:sz="4" w:space="0" w:color="auto"/>
+            <w:tcW w:w="5368" w:type="dxa"/>
+            <w:tcBorders>
+              <w:top w:val="nil"/>
+              <w:left w:val="nil"/>
+              <w:bottom w:val="single" w:sz="8" w:space="0" w:color="auto"/>
+              <w:right w:val="single" w:sz="8" w:space="0" w:color="auto"/>
             </w:tcBorders>
             <w:shd w:val="clear" w:color="auto" w:fill="auto"/>
             <w:vAlign w:val="center"/>
@@ -1457,12 +1458,12 @@
         </w:tc>
         <w:tc>
           <w:tcPr>
-            <w:tcW w:w="1440" w:type="dxa"/>
-            <w:tcBorders>
-              <w:top w:val="nil"/>
-              <w:left w:val="nil"/>
-              <w:bottom w:val="single" w:sz="4" w:space="0" w:color="auto"/>
-              <w:right w:val="single" w:sz="4" w:space="0" w:color="auto"/>
+            <w:tcW w:w="1594" w:type="dxa"/>
+            <w:tcBorders>
+              <w:top w:val="nil"/>
+              <w:left w:val="nil"/>
+              <w:bottom w:val="single" w:sz="8" w:space="0" w:color="auto"/>
+              <w:right w:val="single" w:sz="8" w:space="0" w:color="auto"/>
             </w:tcBorders>
             <w:shd w:val="clear" w:color="auto" w:fill="auto"/>
             <w:vAlign w:val="center"/>
@@ -1499,16 +1500,16 @@
       </w:tr>
       <w:tr>
         <w:trPr>
-          <w:trHeight w:val="1044"/>
+          <w:trHeight w:val="1320"/>
         </w:trPr>
         <w:tc>
           <w:tcPr>
-            <w:tcW w:w="1420" w:type="dxa"/>
-            <w:tcBorders>
-              <w:top w:val="nil"/>
-              <w:left w:val="single" w:sz="4" w:space="0" w:color="auto"/>
-              <w:bottom w:val="single" w:sz="4" w:space="0" w:color="auto"/>
-              <w:right w:val="single" w:sz="4" w:space="0" w:color="auto"/>
+            <w:tcW w:w="1594" w:type="dxa"/>
+            <w:tcBorders>
+              <w:top w:val="nil"/>
+              <w:left w:val="single" w:sz="8" w:space="0" w:color="auto"/>
+              <w:bottom w:val="single" w:sz="8" w:space="0" w:color="auto"/>
+              <w:right w:val="single" w:sz="8" w:space="0" w:color="auto"/>
             </w:tcBorders>
             <w:shd w:val="clear" w:color="auto" w:fill="auto"/>
             <w:vAlign w:val="center"/>
@@ -1544,12 +1545,12 @@
         </w:tc>
         <w:tc>
           <w:tcPr>
-            <w:tcW w:w="6300" w:type="dxa"/>
-            <w:tcBorders>
-              <w:top w:val="nil"/>
-              <w:left w:val="nil"/>
-              <w:bottom w:val="single" w:sz="4" w:space="0" w:color="auto"/>
-              <w:right w:val="single" w:sz="4" w:space="0" w:color="auto"/>
+            <w:tcW w:w="5368" w:type="dxa"/>
+            <w:tcBorders>
+              <w:top w:val="nil"/>
+              <w:left w:val="nil"/>
+              <w:bottom w:val="single" w:sz="8" w:space="0" w:color="auto"/>
+              <w:right w:val="single" w:sz="8" w:space="0" w:color="auto"/>
             </w:tcBorders>
             <w:shd w:val="clear" w:color="auto" w:fill="auto"/>
             <w:vAlign w:val="center"/>
@@ -1581,12 +1582,12 @@
         </w:tc>
         <w:tc>
           <w:tcPr>
-            <w:tcW w:w="1440" w:type="dxa"/>
-            <w:tcBorders>
-              <w:top w:val="nil"/>
-              <w:left w:val="nil"/>
-              <w:bottom w:val="single" w:sz="4" w:space="0" w:color="auto"/>
-              <w:right w:val="single" w:sz="4" w:space="0" w:color="auto"/>
+            <w:tcW w:w="1594" w:type="dxa"/>
+            <w:tcBorders>
+              <w:top w:val="nil"/>
+              <w:left w:val="nil"/>
+              <w:bottom w:val="single" w:sz="8" w:space="0" w:color="auto"/>
+              <w:right w:val="single" w:sz="8" w:space="0" w:color="auto"/>
             </w:tcBorders>
             <w:shd w:val="clear" w:color="auto" w:fill="auto"/>
             <w:vAlign w:val="center"/>
@@ -1623,16 +1624,16 @@
       </w:tr>
       <w:tr>
         <w:trPr>
-          <w:trHeight w:val="1044"/>
+          <w:trHeight w:val="1320"/>
         </w:trPr>
         <w:tc>
           <w:tcPr>
-            <w:tcW w:w="1420" w:type="dxa"/>
-            <w:tcBorders>
-              <w:top w:val="nil"/>
-              <w:left w:val="single" w:sz="4" w:space="0" w:color="auto"/>
-              <w:bottom w:val="single" w:sz="4" w:space="0" w:color="auto"/>
-              <w:right w:val="single" w:sz="4" w:space="0" w:color="auto"/>
+            <w:tcW w:w="1594" w:type="dxa"/>
+            <w:tcBorders>
+              <w:top w:val="nil"/>
+              <w:left w:val="single" w:sz="8" w:space="0" w:color="auto"/>
+              <w:bottom w:val="single" w:sz="8" w:space="0" w:color="auto"/>
+              <w:right w:val="single" w:sz="8" w:space="0" w:color="auto"/>
             </w:tcBorders>
             <w:shd w:val="clear" w:color="auto" w:fill="auto"/>
             <w:vAlign w:val="center"/>
@@ -1668,12 +1669,12 @@
         </w:tc>
         <w:tc>
           <w:tcPr>
-            <w:tcW w:w="6300" w:type="dxa"/>
-            <w:tcBorders>
-              <w:top w:val="nil"/>
-              <w:left w:val="nil"/>
-              <w:bottom w:val="single" w:sz="4" w:space="0" w:color="auto"/>
-              <w:right w:val="single" w:sz="4" w:space="0" w:color="auto"/>
+            <w:tcW w:w="5368" w:type="dxa"/>
+            <w:tcBorders>
+              <w:top w:val="nil"/>
+              <w:left w:val="nil"/>
+              <w:bottom w:val="single" w:sz="8" w:space="0" w:color="auto"/>
+              <w:right w:val="single" w:sz="8" w:space="0" w:color="auto"/>
             </w:tcBorders>
             <w:shd w:val="clear" w:color="auto" w:fill="auto"/>
             <w:vAlign w:val="center"/>
@@ -1705,12 +1706,12 @@
         </w:tc>
         <w:tc>
           <w:tcPr>
-            <w:tcW w:w="1440" w:type="dxa"/>
-            <w:tcBorders>
-              <w:top w:val="nil"/>
-              <w:left w:val="nil"/>
-              <w:bottom w:val="single" w:sz="4" w:space="0" w:color="auto"/>
-              <w:right w:val="single" w:sz="4" w:space="0" w:color="auto"/>
+            <w:tcW w:w="1594" w:type="dxa"/>
+            <w:tcBorders>
+              <w:top w:val="nil"/>
+              <w:left w:val="nil"/>
+              <w:bottom w:val="single" w:sz="8" w:space="0" w:color="auto"/>
+              <w:right w:val="single" w:sz="8" w:space="0" w:color="auto"/>
             </w:tcBorders>
             <w:shd w:val="clear" w:color="auto" w:fill="auto"/>
             <w:vAlign w:val="center"/>
@@ -1747,16 +1748,16 @@
       </w:tr>
       <w:tr>
         <w:trPr>
-          <w:trHeight w:val="1044"/>
+          <w:trHeight w:val="1320"/>
         </w:trPr>
         <w:tc>
           <w:tcPr>
-            <w:tcW w:w="1420" w:type="dxa"/>
-            <w:tcBorders>
-              <w:top w:val="nil"/>
-              <w:left w:val="single" w:sz="4" w:space="0" w:color="auto"/>
-              <w:bottom w:val="single" w:sz="4" w:space="0" w:color="auto"/>
-              <w:right w:val="single" w:sz="4" w:space="0" w:color="auto"/>
+            <w:tcW w:w="1594" w:type="dxa"/>
+            <w:tcBorders>
+              <w:top w:val="nil"/>
+              <w:left w:val="single" w:sz="8" w:space="0" w:color="auto"/>
+              <w:bottom w:val="single" w:sz="8" w:space="0" w:color="auto"/>
+              <w:right w:val="single" w:sz="8" w:space="0" w:color="auto"/>
             </w:tcBorders>
             <w:shd w:val="clear" w:color="auto" w:fill="auto"/>
             <w:vAlign w:val="center"/>
@@ -1792,12 +1793,12 @@
         </w:tc>
         <w:tc>
           <w:tcPr>
-            <w:tcW w:w="6300" w:type="dxa"/>
-            <w:tcBorders>
-              <w:top w:val="nil"/>
-              <w:left w:val="nil"/>
-              <w:bottom w:val="single" w:sz="4" w:space="0" w:color="auto"/>
-              <w:right w:val="single" w:sz="4" w:space="0" w:color="auto"/>
+            <w:tcW w:w="5368" w:type="dxa"/>
+            <w:tcBorders>
+              <w:top w:val="nil"/>
+              <w:left w:val="nil"/>
+              <w:bottom w:val="single" w:sz="8" w:space="0" w:color="auto"/>
+              <w:right w:val="single" w:sz="8" w:space="0" w:color="auto"/>
             </w:tcBorders>
             <w:shd w:val="clear" w:color="auto" w:fill="auto"/>
             <w:vAlign w:val="center"/>
@@ -1823,18 +1824,18 @@
                 <w:szCs w:val="24"/>
                 <w:lang w:eastAsia="pt-BR"/>
               </w:rPr>
-              <w:t>O site deve, através de uma API externa, traduzir CEP para endereço</w:t>
-            </w:r>
-          </w:p>
-        </w:tc>
-        <w:tc>
-          <w:tcPr>
-            <w:tcW w:w="1440" w:type="dxa"/>
-            <w:tcBorders>
-              <w:top w:val="nil"/>
-              <w:left w:val="nil"/>
-              <w:bottom w:val="single" w:sz="4" w:space="0" w:color="auto"/>
-              <w:right w:val="single" w:sz="4" w:space="0" w:color="auto"/>
+              <w:t>O software deve, através de uma API externa, traduzir CEP para endereço</w:t>
+            </w:r>
+          </w:p>
+        </w:tc>
+        <w:tc>
+          <w:tcPr>
+            <w:tcW w:w="1594" w:type="dxa"/>
+            <w:tcBorders>
+              <w:top w:val="nil"/>
+              <w:left w:val="nil"/>
+              <w:bottom w:val="single" w:sz="8" w:space="0" w:color="auto"/>
+              <w:right w:val="single" w:sz="8" w:space="0" w:color="auto"/>
             </w:tcBorders>
             <w:shd w:val="clear" w:color="auto" w:fill="auto"/>
             <w:vAlign w:val="center"/>
@@ -1871,16 +1872,16 @@
       </w:tr>
       <w:tr>
         <w:trPr>
-          <w:trHeight w:val="1044"/>
+          <w:trHeight w:val="1320"/>
         </w:trPr>
         <w:tc>
           <w:tcPr>
-            <w:tcW w:w="1420" w:type="dxa"/>
-            <w:tcBorders>
-              <w:top w:val="nil"/>
-              <w:left w:val="single" w:sz="4" w:space="0" w:color="auto"/>
-              <w:bottom w:val="single" w:sz="4" w:space="0" w:color="auto"/>
-              <w:right w:val="single" w:sz="4" w:space="0" w:color="auto"/>
+            <w:tcW w:w="1594" w:type="dxa"/>
+            <w:tcBorders>
+              <w:top w:val="nil"/>
+              <w:left w:val="single" w:sz="8" w:space="0" w:color="auto"/>
+              <w:bottom w:val="single" w:sz="8" w:space="0" w:color="auto"/>
+              <w:right w:val="single" w:sz="8" w:space="0" w:color="auto"/>
             </w:tcBorders>
             <w:shd w:val="clear" w:color="auto" w:fill="auto"/>
             <w:vAlign w:val="center"/>
@@ -1916,12 +1917,12 @@
         </w:tc>
         <w:tc>
           <w:tcPr>
-            <w:tcW w:w="6300" w:type="dxa"/>
-            <w:tcBorders>
-              <w:top w:val="nil"/>
-              <w:left w:val="nil"/>
-              <w:bottom w:val="single" w:sz="4" w:space="0" w:color="auto"/>
-              <w:right w:val="single" w:sz="4" w:space="0" w:color="auto"/>
+            <w:tcW w:w="5368" w:type="dxa"/>
+            <w:tcBorders>
+              <w:top w:val="nil"/>
+              <w:left w:val="nil"/>
+              <w:bottom w:val="single" w:sz="8" w:space="0" w:color="auto"/>
+              <w:right w:val="single" w:sz="8" w:space="0" w:color="auto"/>
             </w:tcBorders>
             <w:shd w:val="clear" w:color="auto" w:fill="auto"/>
             <w:vAlign w:val="center"/>
@@ -1953,12 +1954,12 @@
         </w:tc>
         <w:tc>
           <w:tcPr>
-            <w:tcW w:w="1440" w:type="dxa"/>
-            <w:tcBorders>
-              <w:top w:val="nil"/>
-              <w:left w:val="nil"/>
-              <w:bottom w:val="single" w:sz="4" w:space="0" w:color="auto"/>
-              <w:right w:val="single" w:sz="4" w:space="0" w:color="auto"/>
+            <w:tcW w:w="1594" w:type="dxa"/>
+            <w:tcBorders>
+              <w:top w:val="nil"/>
+              <w:left w:val="nil"/>
+              <w:bottom w:val="single" w:sz="8" w:space="0" w:color="auto"/>
+              <w:right w:val="single" w:sz="8" w:space="0" w:color="auto"/>
             </w:tcBorders>
             <w:shd w:val="clear" w:color="auto" w:fill="auto"/>
             <w:vAlign w:val="center"/>
@@ -1995,16 +1996,16 @@
       </w:tr>
       <w:tr>
         <w:trPr>
-          <w:trHeight w:val="1044"/>
+          <w:trHeight w:val="1320"/>
         </w:trPr>
         <w:tc>
           <w:tcPr>
-            <w:tcW w:w="1420" w:type="dxa"/>
-            <w:tcBorders>
-              <w:top w:val="nil"/>
-              <w:left w:val="single" w:sz="4" w:space="0" w:color="auto"/>
-              <w:bottom w:val="single" w:sz="4" w:space="0" w:color="auto"/>
-              <w:right w:val="single" w:sz="4" w:space="0" w:color="auto"/>
+            <w:tcW w:w="1594" w:type="dxa"/>
+            <w:tcBorders>
+              <w:top w:val="nil"/>
+              <w:left w:val="single" w:sz="8" w:space="0" w:color="auto"/>
+              <w:bottom w:val="single" w:sz="8" w:space="0" w:color="auto"/>
+              <w:right w:val="single" w:sz="8" w:space="0" w:color="auto"/>
             </w:tcBorders>
             <w:shd w:val="clear" w:color="auto" w:fill="auto"/>
             <w:vAlign w:val="center"/>
@@ -2040,12 +2041,12 @@
         </w:tc>
         <w:tc>
           <w:tcPr>
-            <w:tcW w:w="6300" w:type="dxa"/>
-            <w:tcBorders>
-              <w:top w:val="nil"/>
-              <w:left w:val="nil"/>
-              <w:bottom w:val="single" w:sz="4" w:space="0" w:color="auto"/>
-              <w:right w:val="single" w:sz="4" w:space="0" w:color="auto"/>
+            <w:tcW w:w="5368" w:type="dxa"/>
+            <w:tcBorders>
+              <w:top w:val="nil"/>
+              <w:left w:val="nil"/>
+              <w:bottom w:val="single" w:sz="8" w:space="0" w:color="auto"/>
+              <w:right w:val="single" w:sz="8" w:space="0" w:color="auto"/>
             </w:tcBorders>
             <w:shd w:val="clear" w:color="auto" w:fill="auto"/>
             <w:vAlign w:val="center"/>
@@ -2071,18 +2072,18 @@
                 <w:szCs w:val="24"/>
                 <w:lang w:eastAsia="pt-BR"/>
               </w:rPr>
-              <w:t>O site deve restringir alterações e informações de usuários de nível mais baixo (como o salário dos funcionários)</w:t>
-            </w:r>
-          </w:p>
-        </w:tc>
-        <w:tc>
-          <w:tcPr>
-            <w:tcW w:w="1440" w:type="dxa"/>
-            <w:tcBorders>
-              <w:top w:val="nil"/>
-              <w:left w:val="nil"/>
-              <w:bottom w:val="single" w:sz="4" w:space="0" w:color="auto"/>
-              <w:right w:val="single" w:sz="4" w:space="0" w:color="auto"/>
+              <w:t>O software deve restringir alterações e informações de usuários de nível mais baixo (como o salário dos funcionários)</w:t>
+            </w:r>
+          </w:p>
+        </w:tc>
+        <w:tc>
+          <w:tcPr>
+            <w:tcW w:w="1594" w:type="dxa"/>
+            <w:tcBorders>
+              <w:top w:val="nil"/>
+              <w:left w:val="nil"/>
+              <w:bottom w:val="single" w:sz="8" w:space="0" w:color="auto"/>
+              <w:right w:val="single" w:sz="8" w:space="0" w:color="auto"/>
             </w:tcBorders>
             <w:shd w:val="clear" w:color="auto" w:fill="auto"/>
             <w:vAlign w:val="center"/>
@@ -2119,16 +2120,16 @@
       </w:tr>
       <w:tr>
         <w:trPr>
-          <w:trHeight w:val="1044"/>
+          <w:trHeight w:val="1320"/>
         </w:trPr>
         <w:tc>
           <w:tcPr>
-            <w:tcW w:w="1420" w:type="dxa"/>
-            <w:tcBorders>
-              <w:top w:val="nil"/>
-              <w:left w:val="single" w:sz="4" w:space="0" w:color="auto"/>
-              <w:bottom w:val="single" w:sz="4" w:space="0" w:color="auto"/>
-              <w:right w:val="single" w:sz="4" w:space="0" w:color="auto"/>
+            <w:tcW w:w="1594" w:type="dxa"/>
+            <w:tcBorders>
+              <w:top w:val="nil"/>
+              <w:left w:val="single" w:sz="8" w:space="0" w:color="auto"/>
+              <w:bottom w:val="single" w:sz="8" w:space="0" w:color="auto"/>
+              <w:right w:val="single" w:sz="8" w:space="0" w:color="auto"/>
             </w:tcBorders>
             <w:shd w:val="clear" w:color="auto" w:fill="auto"/>
             <w:vAlign w:val="center"/>
@@ -2164,12 +2165,12 @@
         </w:tc>
         <w:tc>
           <w:tcPr>
-            <w:tcW w:w="6300" w:type="dxa"/>
-            <w:tcBorders>
-              <w:top w:val="nil"/>
-              <w:left w:val="nil"/>
-              <w:bottom w:val="single" w:sz="4" w:space="0" w:color="auto"/>
-              <w:right w:val="single" w:sz="4" w:space="0" w:color="auto"/>
+            <w:tcW w:w="5368" w:type="dxa"/>
+            <w:tcBorders>
+              <w:top w:val="nil"/>
+              <w:left w:val="nil"/>
+              <w:bottom w:val="single" w:sz="8" w:space="0" w:color="auto"/>
+              <w:right w:val="single" w:sz="8" w:space="0" w:color="auto"/>
             </w:tcBorders>
             <w:shd w:val="clear" w:color="auto" w:fill="auto"/>
             <w:vAlign w:val="center"/>
@@ -2201,12 +2202,12 @@
         </w:tc>
         <w:tc>
           <w:tcPr>
-            <w:tcW w:w="1440" w:type="dxa"/>
-            <w:tcBorders>
-              <w:top w:val="nil"/>
-              <w:left w:val="nil"/>
-              <w:bottom w:val="single" w:sz="4" w:space="0" w:color="auto"/>
-              <w:right w:val="single" w:sz="4" w:space="0" w:color="auto"/>
+            <w:tcW w:w="1594" w:type="dxa"/>
+            <w:tcBorders>
+              <w:top w:val="nil"/>
+              <w:left w:val="nil"/>
+              <w:bottom w:val="single" w:sz="8" w:space="0" w:color="auto"/>
+              <w:right w:val="single" w:sz="8" w:space="0" w:color="auto"/>
             </w:tcBorders>
             <w:shd w:val="clear" w:color="auto" w:fill="auto"/>
             <w:vAlign w:val="center"/>
@@ -2344,6 +2345,7 @@
           <w:sz w:val="24"/>
           <w:szCs w:val="24"/>
         </w:rPr>
+        <w:lastRenderedPageBreak/>
         <w:t xml:space="preserve">Tabela 2 – Requisitos Não Funcionais </w:t>
       </w:r>
     </w:p>
@@ -2949,7 +2951,6 @@
                 <w:szCs w:val="24"/>
                 <w:lang w:eastAsia="pt-BR"/>
               </w:rPr>
-              <w:lastRenderedPageBreak/>
               <w:t>RFN 04</w:t>
             </w:r>
           </w:p>
@@ -3113,18 +3114,18 @@
               </w:rPr>
               <w:t xml:space="preserve">O site deve manter sua interface agradável em </w:t>
             </w:r>
-            <w:proofErr w:type="spellStart"/>
-            <w:r>
-              <w:rPr>
-                <w:rFonts w:ascii="Times New Roman" w:eastAsia="Times New Roman" w:hAnsi="Times New Roman" w:cs="Times New Roman"/>
-                <w:color w:val="000000"/>
-                <w:sz w:val="24"/>
-                <w:szCs w:val="24"/>
-                <w:lang w:eastAsia="pt-BR"/>
-              </w:rPr>
-              <w:t>difirentes</w:t>
-            </w:r>
-            <w:proofErr w:type="spellEnd"/>
+            <w:r>
+              <w:rPr>
+                <w:rFonts w:ascii="Times New Roman" w:eastAsia="Times New Roman" w:hAnsi="Times New Roman" w:cs="Times New Roman"/>
+                <w:color w:val="000000"/>
+                <w:sz w:val="24"/>
+                <w:szCs w:val="24"/>
+                <w:lang w:eastAsia="pt-BR"/>
+              </w:rPr>
+              <w:t>diferentes</w:t>
+            </w:r>
+            <w:bookmarkStart w:id="0" w:name="_GoBack"/>
+            <w:bookmarkEnd w:id="0"/>
             <w:r>
               <w:rPr>
                 <w:rFonts w:ascii="Times New Roman" w:eastAsia="Times New Roman" w:hAnsi="Times New Roman" w:cs="Times New Roman"/>
@@ -3965,6 +3966,7 @@
           <w:sz w:val="24"/>
           <w:szCs w:val="24"/>
         </w:rPr>
+        <w:lastRenderedPageBreak/>
         <w:t>- Desenvolvimento do Front-End</w:t>
       </w:r>
     </w:p>
@@ -6243,8 +6245,6 @@
           <w:szCs w:val="24"/>
         </w:rPr>
       </w:pPr>
-      <w:bookmarkStart w:id="0" w:name="_GoBack"/>
-      <w:bookmarkEnd w:id="0"/>
     </w:p>
     <w:p>
       <w:pPr>
@@ -6319,7 +6319,6 @@
           <w:sz w:val="24"/>
           <w:szCs w:val="24"/>
         </w:rPr>
-        <w:lastRenderedPageBreak/>
         <w:t>Cronograma</w:t>
       </w:r>
     </w:p>
@@ -8413,7 +8412,6 @@
           <w:sz w:val="24"/>
           <w:szCs w:val="20"/>
         </w:rPr>
-        <w:lastRenderedPageBreak/>
         <w:t xml:space="preserve">Gráfico de </w:t>
       </w:r>
       <w:proofErr w:type="spellStart"/>
@@ -11016,7 +11014,7 @@
 </file>
 
 <file path=customXml/itemProps1.xml><?xml version="1.0" encoding="utf-8"?>
-<ds:datastoreItem xmlns:ds="http://schemas.openxmlformats.org/officeDocument/2006/customXml" ds:itemID="{63CCE5B5-4B18-46D8-AFF2-3676B62ADD3E}">
+<ds:datastoreItem xmlns:ds="http://schemas.openxmlformats.org/officeDocument/2006/customXml" ds:itemID="{F811EE83-2E45-4492-B046-9DCE2CE3F7E0}">
   <ds:schemaRefs>
     <ds:schemaRef ds:uri="http://schemas.openxmlformats.org/officeDocument/2006/bibliography"/>
   </ds:schemaRefs>

</xml_diff>

<commit_message>
Feat: Modificação de site para software v2
</commit_message>
<xml_diff>
--- a/Documentação/Escopo.docx
+++ b/Documentação/Escopo.docx
@@ -1468,13 +1468,7 @@
               <w:t>O</w:t>
             </w:r>
             <w:r>
-              <w:t xml:space="preserve"> </w:t>
-            </w:r>
-            <w:r>
-              <w:t>software</w:t>
-            </w:r>
-            <w:r>
-              <w:t xml:space="preserve"> </w:t>
+              <w:t xml:space="preserve"> software </w:t>
             </w:r>
             <w:r>
               <w:t>deve bloquear o login após 3 tentativas fracassadas de entrar</w:t>
@@ -1734,9 +1728,7 @@
           <w:szCs w:val="24"/>
         </w:rPr>
       </w:pPr>
-      <w:bookmarkStart w:id="0" w:name="_GoBack"/>
     </w:p>
-    <w:bookmarkEnd w:id="0"/>
     <w:p>
       <w:pPr>
         <w:spacing w:after="0" w:line="360" w:lineRule="auto"/>
@@ -1967,7 +1959,13 @@
               <w:jc w:val="center"/>
             </w:pPr>
             <w:r>
-              <w:t>O site deve possuir um rodapé e cabeçalhos intuitivos</w:t>
+              <w:t xml:space="preserve">O </w:t>
+            </w:r>
+            <w:r>
+              <w:t>software</w:t>
+            </w:r>
+            <w:r>
+              <w:t xml:space="preserve"> deve possuir um rodapé e cabeçalhos intuitivos</w:t>
             </w:r>
           </w:p>
         </w:tc>
@@ -2044,7 +2042,13 @@
               <w:jc w:val="center"/>
             </w:pPr>
             <w:r>
-              <w:t>O site deve possuir design sofisticado e relacionado com o da empresa</w:t>
+              <w:t xml:space="preserve">O </w:t>
+            </w:r>
+            <w:r>
+              <w:t>software</w:t>
+            </w:r>
+            <w:r>
+              <w:t xml:space="preserve"> deve possuir design sofisticado e relacionado com o da empresa</w:t>
             </w:r>
           </w:p>
         </w:tc>
@@ -2121,7 +2125,13 @@
               <w:jc w:val="center"/>
             </w:pPr>
             <w:r>
-              <w:t>O site deve funcionar 24/7</w:t>
+              <w:t xml:space="preserve">O </w:t>
+            </w:r>
+            <w:r>
+              <w:t>software</w:t>
+            </w:r>
+            <w:r>
+              <w:t xml:space="preserve"> deve funcionar 24/7</w:t>
             </w:r>
           </w:p>
         </w:tc>
@@ -2198,7 +2208,13 @@
               <w:jc w:val="center"/>
             </w:pPr>
             <w:r>
-              <w:t>O site deve possuir animações suaves</w:t>
+              <w:t xml:space="preserve">O </w:t>
+            </w:r>
+            <w:r>
+              <w:t>software</w:t>
+            </w:r>
+            <w:r>
+              <w:t xml:space="preserve"> deve possuir animações suaves</w:t>
             </w:r>
           </w:p>
         </w:tc>
@@ -2275,7 +2291,16 @@
               <w:jc w:val="center"/>
             </w:pPr>
             <w:r>
-              <w:t xml:space="preserve">O site deve manter sua interface agradável em </w:t>
+              <w:t xml:space="preserve">O </w:t>
+            </w:r>
+            <w:r>
+              <w:t>software</w:t>
+            </w:r>
+            <w:r>
+              <w:t xml:space="preserve"> </w:t>
+            </w:r>
+            <w:r>
+              <w:t xml:space="preserve">deve manter sua interface agradável em </w:t>
             </w:r>
             <w:r>
               <w:t>diferentes</w:t>
@@ -2358,7 +2383,13 @@
               <w:jc w:val="center"/>
             </w:pPr>
             <w:r>
-              <w:t>O site deve funcionar perfeitamente nos navegadores: Firefox e Google</w:t>
+              <w:t xml:space="preserve">O </w:t>
+            </w:r>
+            <w:r>
+              <w:t>software</w:t>
+            </w:r>
+            <w:r>
+              <w:t xml:space="preserve"> deve funcionar perfeitamente nos navegadores: Firefox e Google</w:t>
             </w:r>
           </w:p>
         </w:tc>
@@ -2435,7 +2466,13 @@
               <w:jc w:val="center"/>
             </w:pPr>
             <w:r>
-              <w:t>O site deve permitir o usuário alterar os temas (tema padrão, tema escuro)</w:t>
+              <w:t xml:space="preserve">O </w:t>
+            </w:r>
+            <w:r>
+              <w:t>software</w:t>
+            </w:r>
+            <w:r>
+              <w:t xml:space="preserve"> deve permitir o usuário alterar os temas (tema padrão, tema escuro)</w:t>
             </w:r>
           </w:p>
         </w:tc>
@@ -2512,7 +2549,13 @@
               <w:jc w:val="center"/>
             </w:pPr>
             <w:r>
-              <w:t>O site carregar em menos de 3 segundos</w:t>
+              <w:t xml:space="preserve">O </w:t>
+            </w:r>
+            <w:r>
+              <w:t>software</w:t>
+            </w:r>
+            <w:r>
+              <w:t xml:space="preserve"> carregar em menos de 3 segundos</w:t>
             </w:r>
           </w:p>
         </w:tc>
@@ -3346,7 +3389,7 @@
                 <w:lang w:eastAsia="pt-BR"/>
               </w:rPr>
             </w:pPr>
-            <w:bookmarkStart w:id="1" w:name="RANGE!B1"/>
+            <w:bookmarkStart w:id="0" w:name="RANGE!B1"/>
             <w:r>
               <w:rPr>
                 <w:rFonts w:eastAsia="Times New Roman" w:cstheme="minorHAnsi"/>
@@ -3357,7 +3400,7 @@
               </w:rPr>
               <w:t>5. HISTÓRIAS DE USUÁRIO</w:t>
             </w:r>
-            <w:bookmarkEnd w:id="1"/>
+            <w:bookmarkEnd w:id="0"/>
           </w:p>
         </w:tc>
       </w:tr>
@@ -3707,7 +3750,18 @@
                 <w:color w:val="000000"/>
                 <w:lang w:eastAsia="pt-BR"/>
               </w:rPr>
-              <w:t xml:space="preserve"> que o site possua uma navegação intuitiva</w:t>
+              <w:t xml:space="preserve"> que o </w:t>
+            </w:r>
+            <w:r>
+              <w:t>software</w:t>
+            </w:r>
+            <w:r>
+              <w:rPr>
+                <w:rFonts w:eastAsia="Times New Roman" w:cstheme="minorHAnsi"/>
+                <w:color w:val="000000"/>
+                <w:lang w:eastAsia="pt-BR"/>
+              </w:rPr>
+              <w:t xml:space="preserve"> possua uma navegação intuitiva</w:t>
             </w:r>
           </w:p>
         </w:tc>
@@ -4032,7 +4086,26 @@
                 <w:color w:val="000000"/>
                 <w:lang w:eastAsia="pt-BR"/>
               </w:rPr>
-              <w:t xml:space="preserve"> que o site possua uma página home com dashboards.   </w:t>
+              <w:t xml:space="preserve"> que o </w:t>
+            </w:r>
+            <w:r>
+              <w:t>software</w:t>
+            </w:r>
+            <w:r>
+              <w:rPr>
+                <w:rFonts w:eastAsia="Times New Roman" w:cstheme="minorHAnsi"/>
+                <w:color w:val="000000"/>
+                <w:lang w:eastAsia="pt-BR"/>
+              </w:rPr>
+              <w:t xml:space="preserve"> </w:t>
+            </w:r>
+            <w:r>
+              <w:rPr>
+                <w:rFonts w:eastAsia="Times New Roman" w:cstheme="minorHAnsi"/>
+                <w:color w:val="000000"/>
+                <w:lang w:eastAsia="pt-BR"/>
+              </w:rPr>
+              <w:t xml:space="preserve">e possua uma página home com dashboards.   </w:t>
             </w:r>
           </w:p>
         </w:tc>
@@ -4742,7 +4815,18 @@
                 <w:color w:val="000000"/>
                 <w:lang w:eastAsia="pt-BR"/>
               </w:rPr>
-              <w:t>o site possua uma página de login</w:t>
+              <w:t xml:space="preserve">o </w:t>
+            </w:r>
+            <w:r>
+              <w:t>software</w:t>
+            </w:r>
+            <w:r>
+              <w:rPr>
+                <w:rFonts w:eastAsia="Times New Roman" w:cstheme="minorHAnsi"/>
+                <w:color w:val="000000"/>
+                <w:lang w:eastAsia="pt-BR"/>
+              </w:rPr>
+              <w:t xml:space="preserve"> possua uma página de login</w:t>
             </w:r>
           </w:p>
         </w:tc>
@@ -5238,7 +5322,7 @@
                 <w:lang w:eastAsia="pt-BR"/>
               </w:rPr>
             </w:pPr>
-            <w:bookmarkStart w:id="2" w:name="RANGE!B18"/>
+            <w:bookmarkStart w:id="1" w:name="RANGE!B18"/>
             <w:r>
               <w:rPr>
                 <w:rFonts w:eastAsia="Times New Roman" w:cstheme="minorHAnsi"/>
@@ -5250,7 +5334,7 @@
               <w:lastRenderedPageBreak/>
               <w:t>RF 006</w:t>
             </w:r>
-            <w:bookmarkEnd w:id="2"/>
+            <w:bookmarkEnd w:id="1"/>
           </w:p>
         </w:tc>
         <w:tc>
@@ -5784,7 +5868,10 @@
                 <w:color w:val="000000"/>
                 <w:lang w:eastAsia="pt-BR"/>
               </w:rPr>
-              <w:t xml:space="preserve"> que o site</w:t>
+              <w:t xml:space="preserve"> que o </w:t>
+            </w:r>
+            <w:r>
+              <w:t>software</w:t>
             </w:r>
             <w:r>
               <w:rPr>
@@ -7134,7 +7221,18 @@
                 <w:color w:val="000000"/>
                 <w:lang w:eastAsia="pt-BR"/>
               </w:rPr>
-              <w:t xml:space="preserve"> que o site possua uma página de perfil funcional</w:t>
+              <w:t xml:space="preserve"> que o </w:t>
+            </w:r>
+            <w:r>
+              <w:t>software</w:t>
+            </w:r>
+            <w:r>
+              <w:rPr>
+                <w:rFonts w:eastAsia="Times New Roman" w:cstheme="minorHAnsi"/>
+                <w:color w:val="000000"/>
+                <w:lang w:eastAsia="pt-BR"/>
+              </w:rPr>
+              <w:t xml:space="preserve"> possua uma página de perfil funcional</w:t>
             </w:r>
           </w:p>
         </w:tc>
@@ -14532,6 +14630,8 @@
         </w:rPr>
         <w:t>Fonte: Os autores</w:t>
       </w:r>
+      <w:bookmarkStart w:id="2" w:name="_GoBack"/>
+      <w:bookmarkEnd w:id="2"/>
       <w:r>
         <w:rPr>
           <w:rFonts w:ascii="Arial" w:hAnsi="Arial" w:cs="Arial"/>
@@ -19818,7 +19918,7 @@
 </file>
 
 <file path=customXml/itemProps1.xml><?xml version="1.0" encoding="utf-8"?>
-<ds:datastoreItem xmlns:ds="http://schemas.openxmlformats.org/officeDocument/2006/customXml" ds:itemID="{CED6F263-0182-43A1-A1E3-2A3ADB25BDE1}">
+<ds:datastoreItem xmlns:ds="http://schemas.openxmlformats.org/officeDocument/2006/customXml" ds:itemID="{F34EB2A0-C59B-4108-A648-62B6AA1A93EA}">
   <ds:schemaRefs>
     <ds:schemaRef ds:uri="http://schemas.openxmlformats.org/officeDocument/2006/bibliography"/>
   </ds:schemaRefs>

</xml_diff>

<commit_message>
FEAT:Adicionei os arquivos de teste do site
</commit_message>
<xml_diff>
--- a/Documentação/Escopo.docx
+++ b/Documentação/Escopo.docx
@@ -5,19 +5,19 @@
     <w:tbl>
       <w:tblPr>
         <w:tblStyle w:val="Tabelacomgrade"/>
-        <w:tblW w:w="8075" w:type="dxa"/>
+        <w:tblW w:w="9067" w:type="dxa"/>
         <w:tblLook w:val="04A0" w:firstRow="1" w:lastRow="0" w:firstColumn="1" w:lastColumn="0" w:noHBand="0" w:noVBand="1"/>
       </w:tblPr>
       <w:tblGrid>
         <w:gridCol w:w="1045"/>
         <w:gridCol w:w="1218"/>
         <w:gridCol w:w="3828"/>
-        <w:gridCol w:w="1984"/>
+        <w:gridCol w:w="2976"/>
       </w:tblGrid>
       <w:tr>
         <w:tc>
           <w:tcPr>
-            <w:tcW w:w="8075" w:type="dxa"/>
+            <w:tcW w:w="9067" w:type="dxa"/>
             <w:gridSpan w:val="4"/>
             <w:shd w:val="clear" w:color="auto" w:fill="B4C6E7" w:themeFill="accent1" w:themeFillTint="66"/>
           </w:tcPr>
@@ -73,7 +73,7 @@
         </w:tc>
         <w:tc>
           <w:tcPr>
-            <w:tcW w:w="1984" w:type="dxa"/>
+            <w:tcW w:w="2976" w:type="dxa"/>
           </w:tcPr>
           <w:p>
             <w:pPr>
@@ -86,6 +86,9 @@
         </w:tc>
       </w:tr>
       <w:tr>
+        <w:trPr>
+          <w:trHeight w:val="1265"/>
+        </w:trPr>
         <w:tc>
           <w:tcPr>
             <w:tcW w:w="1045" w:type="dxa"/>
@@ -127,15 +130,43 @@
         </w:tc>
         <w:tc>
           <w:tcPr>
-            <w:tcW w:w="1984" w:type="dxa"/>
-          </w:tcPr>
-          <w:p>
-            <w:pPr>
-              <w:jc w:val="center"/>
-            </w:pPr>
-            <w:r>
-              <w:t>Equipe</w:t>
-            </w:r>
+            <w:tcW w:w="2976" w:type="dxa"/>
+          </w:tcPr>
+          <w:p>
+            <w:pPr>
+              <w:jc w:val="center"/>
+            </w:pPr>
+            <w:r>
+              <w:t>José Reinaldo Leão da Silva</w:t>
+            </w:r>
+            <w:r>
+              <w:t xml:space="preserve">, </w:t>
+            </w:r>
+            <w:r>
+              <w:t>Mateus Lourenço Alvarenga</w:t>
+            </w:r>
+            <w:r>
+              <w:t xml:space="preserve">, </w:t>
+            </w:r>
+            <w:r>
+              <w:t>Murilo Ramos da Silva</w:t>
+            </w:r>
+            <w:r>
+              <w:t>,</w:t>
+            </w:r>
+          </w:p>
+          <w:p>
+            <w:pPr>
+              <w:jc w:val="center"/>
+            </w:pPr>
+            <w:r>
+              <w:t>Yuri Momesso de Lima</w:t>
+            </w:r>
+          </w:p>
+          <w:p>
+            <w:pPr>
+              <w:jc w:val="center"/>
+            </w:pPr>
           </w:p>
         </w:tc>
       </w:tr>
@@ -181,14 +212,22 @@
         </w:tc>
         <w:tc>
           <w:tcPr>
-            <w:tcW w:w="1984" w:type="dxa"/>
-          </w:tcPr>
-          <w:p>
-            <w:pPr>
-              <w:jc w:val="center"/>
-            </w:pPr>
-            <w:r>
-              <w:t>Equipe</w:t>
+            <w:tcW w:w="2976" w:type="dxa"/>
+          </w:tcPr>
+          <w:p>
+            <w:pPr>
+              <w:jc w:val="center"/>
+            </w:pPr>
+            <w:r>
+              <w:t>Mateus Lourenço Alvarenga</w:t>
+            </w:r>
+          </w:p>
+          <w:p>
+            <w:pPr>
+              <w:jc w:val="center"/>
+            </w:pPr>
+            <w:r>
+              <w:t>Yuri Momesso de Lima</w:t>
             </w:r>
           </w:p>
         </w:tc>
@@ -235,14 +274,14 @@
         </w:tc>
         <w:tc>
           <w:tcPr>
-            <w:tcW w:w="1984" w:type="dxa"/>
-          </w:tcPr>
-          <w:p>
-            <w:pPr>
-              <w:jc w:val="center"/>
-            </w:pPr>
-            <w:r>
-              <w:t>Equipe</w:t>
+            <w:tcW w:w="2976" w:type="dxa"/>
+          </w:tcPr>
+          <w:p>
+            <w:pPr>
+              <w:jc w:val="center"/>
+            </w:pPr>
+            <w:r>
+              <w:t>Yuri Momesso de Lima</w:t>
             </w:r>
           </w:p>
         </w:tc>
@@ -255,6 +294,7 @@
         <w:jc w:val="both"/>
         <w:rPr>
           <w:rFonts w:ascii="Arial" w:hAnsi="Arial" w:cs="Arial"/>
+          <w:b/>
           <w:sz w:val="24"/>
           <w:szCs w:val="24"/>
         </w:rPr>
@@ -938,6 +978,7 @@
               <w:jc w:val="center"/>
             </w:pPr>
             <w:r>
+              <w:lastRenderedPageBreak/>
               <w:t>RF 03</w:t>
             </w:r>
           </w:p>
@@ -1023,7 +1064,6 @@
               <w:jc w:val="center"/>
             </w:pPr>
             <w:r>
-              <w:lastRenderedPageBreak/>
               <w:t>RF 04</w:t>
             </w:r>
           </w:p>
@@ -1081,6 +1121,176 @@
                 <w:b/>
               </w:rPr>
               <w:t>Essencial</w:t>
+            </w:r>
+          </w:p>
+        </w:tc>
+      </w:tr>
+      <w:tr>
+        <w:trPr>
+          <w:gridAfter w:val="1"/>
+          <w:wAfter w:w="8" w:type="dxa"/>
+          <w:trHeight w:val="1076"/>
+        </w:trPr>
+        <w:tc>
+          <w:tcPr>
+            <w:tcW w:w="1594" w:type="dxa"/>
+            <w:tcBorders>
+              <w:top w:val="nil"/>
+              <w:left w:val="single" w:sz="8" w:space="0" w:color="auto"/>
+              <w:bottom w:val="single" w:sz="8" w:space="0" w:color="auto"/>
+              <w:right w:val="single" w:sz="8" w:space="0" w:color="auto"/>
+            </w:tcBorders>
+            <w:shd w:val="clear" w:color="auto" w:fill="auto"/>
+            <w:vAlign w:val="center"/>
+            <w:hideMark/>
+          </w:tcPr>
+          <w:p>
+            <w:pPr>
+              <w:jc w:val="center"/>
+            </w:pPr>
+            <w:r>
+              <w:t>RF 05</w:t>
+            </w:r>
+          </w:p>
+        </w:tc>
+        <w:tc>
+          <w:tcPr>
+            <w:tcW w:w="5528" w:type="dxa"/>
+            <w:tcBorders>
+              <w:top w:val="nil"/>
+              <w:left w:val="nil"/>
+              <w:bottom w:val="single" w:sz="8" w:space="0" w:color="auto"/>
+              <w:right w:val="single" w:sz="8" w:space="0" w:color="auto"/>
+            </w:tcBorders>
+            <w:shd w:val="clear" w:color="auto" w:fill="auto"/>
+            <w:vAlign w:val="center"/>
+            <w:hideMark/>
+          </w:tcPr>
+          <w:p>
+            <w:pPr>
+              <w:jc w:val="center"/>
+            </w:pPr>
+            <w:r>
+              <w:t xml:space="preserve">O </w:t>
+            </w:r>
+            <w:r>
+              <w:t xml:space="preserve">software </w:t>
+            </w:r>
+            <w:r>
+              <w:t>deve permitir que o usuário altere o tipo de gráfico no dashboard</w:t>
+            </w:r>
+          </w:p>
+        </w:tc>
+        <w:tc>
+          <w:tcPr>
+            <w:tcW w:w="1594" w:type="dxa"/>
+            <w:tcBorders>
+              <w:top w:val="nil"/>
+              <w:left w:val="nil"/>
+              <w:bottom w:val="single" w:sz="8" w:space="0" w:color="auto"/>
+              <w:right w:val="single" w:sz="8" w:space="0" w:color="auto"/>
+            </w:tcBorders>
+            <w:shd w:val="clear" w:color="auto" w:fill="auto"/>
+            <w:vAlign w:val="center"/>
+            <w:hideMark/>
+          </w:tcPr>
+          <w:p>
+            <w:pPr>
+              <w:jc w:val="center"/>
+              <w:rPr>
+                <w:b/>
+              </w:rPr>
+            </w:pPr>
+            <w:r>
+              <w:rPr>
+                <w:b/>
+              </w:rPr>
+              <w:t>Importante</w:t>
+            </w:r>
+          </w:p>
+        </w:tc>
+      </w:tr>
+      <w:tr>
+        <w:trPr>
+          <w:gridAfter w:val="1"/>
+          <w:wAfter w:w="8" w:type="dxa"/>
+          <w:trHeight w:val="1248"/>
+        </w:trPr>
+        <w:tc>
+          <w:tcPr>
+            <w:tcW w:w="1594" w:type="dxa"/>
+            <w:tcBorders>
+              <w:top w:val="nil"/>
+              <w:left w:val="single" w:sz="8" w:space="0" w:color="auto"/>
+              <w:bottom w:val="single" w:sz="8" w:space="0" w:color="auto"/>
+              <w:right w:val="single" w:sz="8" w:space="0" w:color="auto"/>
+            </w:tcBorders>
+            <w:shd w:val="clear" w:color="auto" w:fill="auto"/>
+            <w:vAlign w:val="center"/>
+            <w:hideMark/>
+          </w:tcPr>
+          <w:p>
+            <w:pPr>
+              <w:jc w:val="center"/>
+            </w:pPr>
+            <w:r>
+              <w:t>RF 06</w:t>
+            </w:r>
+          </w:p>
+        </w:tc>
+        <w:tc>
+          <w:tcPr>
+            <w:tcW w:w="5528" w:type="dxa"/>
+            <w:tcBorders>
+              <w:top w:val="nil"/>
+              <w:left w:val="nil"/>
+              <w:bottom w:val="single" w:sz="8" w:space="0" w:color="auto"/>
+              <w:right w:val="single" w:sz="8" w:space="0" w:color="auto"/>
+            </w:tcBorders>
+            <w:shd w:val="clear" w:color="auto" w:fill="auto"/>
+            <w:vAlign w:val="center"/>
+            <w:hideMark/>
+          </w:tcPr>
+          <w:p>
+            <w:pPr>
+              <w:jc w:val="center"/>
+            </w:pPr>
+            <w:r>
+              <w:t xml:space="preserve">O </w:t>
+            </w:r>
+            <w:r>
+              <w:t xml:space="preserve">software </w:t>
+            </w:r>
+            <w:r>
+              <w:t>deve possuir uma página funcional de cadastro de funcionários, produtos e fornecedores</w:t>
+            </w:r>
+          </w:p>
+        </w:tc>
+        <w:tc>
+          <w:tcPr>
+            <w:tcW w:w="1594" w:type="dxa"/>
+            <w:tcBorders>
+              <w:top w:val="nil"/>
+              <w:left w:val="nil"/>
+              <w:bottom w:val="single" w:sz="8" w:space="0" w:color="auto"/>
+              <w:right w:val="single" w:sz="8" w:space="0" w:color="auto"/>
+            </w:tcBorders>
+            <w:shd w:val="clear" w:color="auto" w:fill="auto"/>
+            <w:vAlign w:val="center"/>
+            <w:hideMark/>
+          </w:tcPr>
+          <w:p>
+            <w:pPr>
+              <w:jc w:val="center"/>
+              <w:rPr>
+                <w:b/>
+              </w:rPr>
+            </w:pPr>
+            <w:r>
+              <w:rPr>
+                <w:b/>
+              </w:rPr>
+              <w:t>Importante</w:t>
             </w:r>
           </w:p>
         </w:tc>
@@ -1109,7 +1319,7 @@
               <w:jc w:val="center"/>
             </w:pPr>
             <w:r>
-              <w:t>RF 05</w:t>
+              <w:t>RF 07</w:t>
             </w:r>
           </w:p>
         </w:tc>
@@ -1136,8 +1346,10 @@
             <w:r>
               <w:t xml:space="preserve">software </w:t>
             </w:r>
-            <w:r>
-              <w:t>deve permitir que o usuário altere o tipo de gráfico no dashboard</w:t>
+            <w:bookmarkStart w:id="0" w:name="_GoBack"/>
+            <w:bookmarkEnd w:id="0"/>
+            <w:r>
+              <w:t>deve possuir uma página funcional de metas e desempenho, onde cada funcionário poderá visualizar o andamento do seu trabalho e o que ele precisa cumprir</w:t>
             </w:r>
           </w:p>
         </w:tc>
@@ -1194,7 +1406,7 @@
               <w:jc w:val="center"/>
             </w:pPr>
             <w:r>
-              <w:t>RF 06</w:t>
+              <w:t>RF 08</w:t>
             </w:r>
           </w:p>
         </w:tc>
@@ -1216,13 +1428,7 @@
               <w:jc w:val="center"/>
             </w:pPr>
             <w:r>
-              <w:t xml:space="preserve">O </w:t>
-            </w:r>
-            <w:r>
-              <w:t xml:space="preserve">software </w:t>
-            </w:r>
-            <w:r>
-              <w:t>deve possuir uma página funcional de cadastro de funcionários, produtos e fornecedores</w:t>
+              <w:t>O software deve, através de uma API externa, traduzir CEP para endereço</w:t>
             </w:r>
           </w:p>
         </w:tc>
@@ -1250,7 +1456,7 @@
               <w:rPr>
                 <w:b/>
               </w:rPr>
-              <w:t>Importante</w:t>
+              <w:t>Desejável</w:t>
             </w:r>
           </w:p>
         </w:tc>
@@ -1259,7 +1465,7 @@
         <w:trPr>
           <w:gridAfter w:val="1"/>
           <w:wAfter w:w="8" w:type="dxa"/>
-          <w:trHeight w:val="1320"/>
+          <w:trHeight w:val="1097"/>
         </w:trPr>
         <w:tc>
           <w:tcPr>
@@ -1279,7 +1485,7 @@
               <w:jc w:val="center"/>
             </w:pPr>
             <w:r>
-              <w:t>RF 07</w:t>
+              <w:t>RF 09</w:t>
             </w:r>
           </w:p>
         </w:tc>
@@ -1301,7 +1507,13 @@
               <w:jc w:val="center"/>
             </w:pPr>
             <w:r>
-              <w:t>O site deve possuir uma página funcional de metas e desempenho, onde cada funcionário poderá visualizar o andamento do seu trabalho e o que ele precisa cumprir</w:t>
+              <w:t xml:space="preserve">O </w:t>
+            </w:r>
+            <w:r>
+              <w:t xml:space="preserve">software </w:t>
+            </w:r>
+            <w:r>
+              <w:t>deve bloquear o login após 3 tentativas fracassadas de entrar</w:t>
             </w:r>
           </w:p>
         </w:tc>
@@ -1329,7 +1541,7 @@
               <w:rPr>
                 <w:b/>
               </w:rPr>
-              <w:t>Importante</w:t>
+              <w:t>Desejável</w:t>
             </w:r>
           </w:p>
         </w:tc>
@@ -1338,7 +1550,7 @@
         <w:trPr>
           <w:gridAfter w:val="1"/>
           <w:wAfter w:w="8" w:type="dxa"/>
-          <w:trHeight w:val="1320"/>
+          <w:trHeight w:val="1255"/>
         </w:trPr>
         <w:tc>
           <w:tcPr>
@@ -1358,7 +1570,7 @@
               <w:jc w:val="center"/>
             </w:pPr>
             <w:r>
-              <w:t>RF 08</w:t>
+              <w:t>RF 10</w:t>
             </w:r>
           </w:p>
         </w:tc>
@@ -1380,7 +1592,7 @@
               <w:jc w:val="center"/>
             </w:pPr>
             <w:r>
-              <w:t>O software deve, através de uma API externa, traduzir CEP para endereço</w:t>
+              <w:t>O software deve restringir alterações e informações de usuários de nível mais baixo (como o salário dos funcionários)</w:t>
             </w:r>
           </w:p>
         </w:tc>
@@ -1417,171 +1629,7 @@
         <w:trPr>
           <w:gridAfter w:val="1"/>
           <w:wAfter w:w="8" w:type="dxa"/>
-          <w:trHeight w:val="1320"/>
-        </w:trPr>
-        <w:tc>
-          <w:tcPr>
-            <w:tcW w:w="1594" w:type="dxa"/>
-            <w:tcBorders>
-              <w:top w:val="nil"/>
-              <w:left w:val="single" w:sz="8" w:space="0" w:color="auto"/>
-              <w:bottom w:val="single" w:sz="8" w:space="0" w:color="auto"/>
-              <w:right w:val="single" w:sz="8" w:space="0" w:color="auto"/>
-            </w:tcBorders>
-            <w:shd w:val="clear" w:color="auto" w:fill="auto"/>
-            <w:vAlign w:val="center"/>
-            <w:hideMark/>
-          </w:tcPr>
-          <w:p>
-            <w:pPr>
-              <w:jc w:val="center"/>
-            </w:pPr>
-            <w:r>
-              <w:t>RF 09</w:t>
-            </w:r>
-          </w:p>
-        </w:tc>
-        <w:tc>
-          <w:tcPr>
-            <w:tcW w:w="5528" w:type="dxa"/>
-            <w:tcBorders>
-              <w:top w:val="nil"/>
-              <w:left w:val="nil"/>
-              <w:bottom w:val="single" w:sz="8" w:space="0" w:color="auto"/>
-              <w:right w:val="single" w:sz="8" w:space="0" w:color="auto"/>
-            </w:tcBorders>
-            <w:shd w:val="clear" w:color="auto" w:fill="auto"/>
-            <w:vAlign w:val="center"/>
-            <w:hideMark/>
-          </w:tcPr>
-          <w:p>
-            <w:pPr>
-              <w:jc w:val="center"/>
-            </w:pPr>
-            <w:r>
-              <w:t xml:space="preserve">O </w:t>
-            </w:r>
-            <w:r>
-              <w:t xml:space="preserve">software </w:t>
-            </w:r>
-            <w:r>
-              <w:t>deve bloquear o login após 3 tentativas fracassadas de entrar</w:t>
-            </w:r>
-          </w:p>
-        </w:tc>
-        <w:tc>
-          <w:tcPr>
-            <w:tcW w:w="1594" w:type="dxa"/>
-            <w:tcBorders>
-              <w:top w:val="nil"/>
-              <w:left w:val="nil"/>
-              <w:bottom w:val="single" w:sz="8" w:space="0" w:color="auto"/>
-              <w:right w:val="single" w:sz="8" w:space="0" w:color="auto"/>
-            </w:tcBorders>
-            <w:shd w:val="clear" w:color="auto" w:fill="auto"/>
-            <w:vAlign w:val="center"/>
-            <w:hideMark/>
-          </w:tcPr>
-          <w:p>
-            <w:pPr>
-              <w:jc w:val="center"/>
-              <w:rPr>
-                <w:b/>
-              </w:rPr>
-            </w:pPr>
-            <w:r>
-              <w:rPr>
-                <w:b/>
-              </w:rPr>
-              <w:t>Desejável</w:t>
-            </w:r>
-          </w:p>
-        </w:tc>
-      </w:tr>
-      <w:tr>
-        <w:trPr>
-          <w:gridAfter w:val="1"/>
-          <w:wAfter w:w="8" w:type="dxa"/>
-          <w:trHeight w:val="1320"/>
-        </w:trPr>
-        <w:tc>
-          <w:tcPr>
-            <w:tcW w:w="1594" w:type="dxa"/>
-            <w:tcBorders>
-              <w:top w:val="nil"/>
-              <w:left w:val="single" w:sz="8" w:space="0" w:color="auto"/>
-              <w:bottom w:val="single" w:sz="8" w:space="0" w:color="auto"/>
-              <w:right w:val="single" w:sz="8" w:space="0" w:color="auto"/>
-            </w:tcBorders>
-            <w:shd w:val="clear" w:color="auto" w:fill="auto"/>
-            <w:vAlign w:val="center"/>
-            <w:hideMark/>
-          </w:tcPr>
-          <w:p>
-            <w:pPr>
-              <w:jc w:val="center"/>
-            </w:pPr>
-            <w:r>
-              <w:t>RF 10</w:t>
-            </w:r>
-          </w:p>
-        </w:tc>
-        <w:tc>
-          <w:tcPr>
-            <w:tcW w:w="5528" w:type="dxa"/>
-            <w:tcBorders>
-              <w:top w:val="nil"/>
-              <w:left w:val="nil"/>
-              <w:bottom w:val="single" w:sz="8" w:space="0" w:color="auto"/>
-              <w:right w:val="single" w:sz="8" w:space="0" w:color="auto"/>
-            </w:tcBorders>
-            <w:shd w:val="clear" w:color="auto" w:fill="auto"/>
-            <w:vAlign w:val="center"/>
-            <w:hideMark/>
-          </w:tcPr>
-          <w:p>
-            <w:pPr>
-              <w:jc w:val="center"/>
-            </w:pPr>
-            <w:r>
-              <w:t>O software deve restringir alterações e informações de usuários de nível mais baixo (como o salário dos funcionários)</w:t>
-            </w:r>
-          </w:p>
-        </w:tc>
-        <w:tc>
-          <w:tcPr>
-            <w:tcW w:w="1594" w:type="dxa"/>
-            <w:tcBorders>
-              <w:top w:val="nil"/>
-              <w:left w:val="nil"/>
-              <w:bottom w:val="single" w:sz="8" w:space="0" w:color="auto"/>
-              <w:right w:val="single" w:sz="8" w:space="0" w:color="auto"/>
-            </w:tcBorders>
-            <w:shd w:val="clear" w:color="auto" w:fill="auto"/>
-            <w:vAlign w:val="center"/>
-            <w:hideMark/>
-          </w:tcPr>
-          <w:p>
-            <w:pPr>
-              <w:jc w:val="center"/>
-              <w:rPr>
-                <w:b/>
-              </w:rPr>
-            </w:pPr>
-            <w:r>
-              <w:rPr>
-                <w:b/>
-              </w:rPr>
-              <w:t>Desejável</w:t>
-            </w:r>
-          </w:p>
-        </w:tc>
-      </w:tr>
-      <w:tr>
-        <w:trPr>
-          <w:gridAfter w:val="1"/>
-          <w:wAfter w:w="8" w:type="dxa"/>
-          <w:trHeight w:val="1320"/>
+          <w:trHeight w:val="1188"/>
         </w:trPr>
         <w:tc>
           <w:tcPr>
@@ -1687,20 +1735,6 @@
     <w:p>
       <w:pPr>
         <w:spacing w:after="0" w:line="360" w:lineRule="auto"/>
-        <w:ind w:firstLine="709"/>
-        <w:jc w:val="both"/>
-        <w:rPr>
-          <w:rFonts w:ascii="Arial" w:hAnsi="Arial" w:cs="Arial"/>
-          <w:b/>
-          <w:sz w:val="24"/>
-          <w:szCs w:val="24"/>
-        </w:rPr>
-      </w:pPr>
-    </w:p>
-    <w:p>
-      <w:pPr>
-        <w:spacing w:after="0" w:line="360" w:lineRule="auto"/>
-        <w:ind w:firstLine="709"/>
         <w:jc w:val="both"/>
         <w:rPr>
           <w:rFonts w:ascii="Arial" w:hAnsi="Arial" w:cs="Arial"/>
@@ -2699,6 +2733,162 @@
     </w:p>
     <w:p>
       <w:pPr>
+        <w:spacing w:after="0" w:line="360" w:lineRule="auto"/>
+        <w:ind w:firstLine="709"/>
+        <w:jc w:val="both"/>
+        <w:rPr>
+          <w:rFonts w:ascii="Arial" w:hAnsi="Arial" w:cs="Arial"/>
+          <w:b/>
+          <w:sz w:val="20"/>
+          <w:szCs w:val="24"/>
+        </w:rPr>
+      </w:pPr>
+    </w:p>
+    <w:p>
+      <w:pPr>
+        <w:spacing w:after="0" w:line="360" w:lineRule="auto"/>
+        <w:ind w:firstLine="709"/>
+        <w:jc w:val="both"/>
+        <w:rPr>
+          <w:rFonts w:ascii="Arial" w:hAnsi="Arial" w:cs="Arial"/>
+          <w:b/>
+          <w:sz w:val="20"/>
+          <w:szCs w:val="24"/>
+        </w:rPr>
+      </w:pPr>
+    </w:p>
+    <w:p>
+      <w:pPr>
+        <w:spacing w:after="0" w:line="360" w:lineRule="auto"/>
+        <w:ind w:firstLine="709"/>
+        <w:jc w:val="both"/>
+        <w:rPr>
+          <w:rFonts w:ascii="Arial" w:hAnsi="Arial" w:cs="Arial"/>
+          <w:b/>
+          <w:sz w:val="20"/>
+          <w:szCs w:val="24"/>
+        </w:rPr>
+      </w:pPr>
+    </w:p>
+    <w:p>
+      <w:pPr>
+        <w:spacing w:after="0" w:line="360" w:lineRule="auto"/>
+        <w:ind w:firstLine="709"/>
+        <w:jc w:val="both"/>
+        <w:rPr>
+          <w:rFonts w:ascii="Arial" w:hAnsi="Arial" w:cs="Arial"/>
+          <w:b/>
+          <w:sz w:val="20"/>
+          <w:szCs w:val="24"/>
+        </w:rPr>
+      </w:pPr>
+    </w:p>
+    <w:p>
+      <w:pPr>
+        <w:spacing w:after="0" w:line="360" w:lineRule="auto"/>
+        <w:ind w:firstLine="709"/>
+        <w:jc w:val="both"/>
+        <w:rPr>
+          <w:rFonts w:ascii="Arial" w:hAnsi="Arial" w:cs="Arial"/>
+          <w:b/>
+          <w:sz w:val="20"/>
+          <w:szCs w:val="24"/>
+        </w:rPr>
+      </w:pPr>
+    </w:p>
+    <w:p>
+      <w:pPr>
+        <w:spacing w:after="0" w:line="360" w:lineRule="auto"/>
+        <w:ind w:firstLine="709"/>
+        <w:jc w:val="both"/>
+        <w:rPr>
+          <w:rFonts w:ascii="Arial" w:hAnsi="Arial" w:cs="Arial"/>
+          <w:b/>
+          <w:sz w:val="20"/>
+          <w:szCs w:val="24"/>
+        </w:rPr>
+      </w:pPr>
+    </w:p>
+    <w:p>
+      <w:pPr>
+        <w:spacing w:after="0" w:line="360" w:lineRule="auto"/>
+        <w:ind w:firstLine="709"/>
+        <w:jc w:val="both"/>
+        <w:rPr>
+          <w:rFonts w:ascii="Arial" w:hAnsi="Arial" w:cs="Arial"/>
+          <w:b/>
+          <w:sz w:val="20"/>
+          <w:szCs w:val="24"/>
+        </w:rPr>
+      </w:pPr>
+    </w:p>
+    <w:p>
+      <w:pPr>
+        <w:spacing w:after="0" w:line="360" w:lineRule="auto"/>
+        <w:ind w:firstLine="709"/>
+        <w:jc w:val="both"/>
+        <w:rPr>
+          <w:rFonts w:ascii="Arial" w:hAnsi="Arial" w:cs="Arial"/>
+          <w:b/>
+          <w:sz w:val="20"/>
+          <w:szCs w:val="24"/>
+        </w:rPr>
+      </w:pPr>
+    </w:p>
+    <w:p>
+      <w:pPr>
+        <w:spacing w:after="0" w:line="360" w:lineRule="auto"/>
+        <w:ind w:firstLine="709"/>
+        <w:jc w:val="both"/>
+        <w:rPr>
+          <w:rFonts w:ascii="Arial" w:hAnsi="Arial" w:cs="Arial"/>
+          <w:b/>
+          <w:sz w:val="20"/>
+          <w:szCs w:val="24"/>
+        </w:rPr>
+      </w:pPr>
+    </w:p>
+    <w:p>
+      <w:pPr>
+        <w:spacing w:after="0" w:line="360" w:lineRule="auto"/>
+        <w:ind w:firstLine="709"/>
+        <w:jc w:val="both"/>
+        <w:rPr>
+          <w:rFonts w:ascii="Arial" w:hAnsi="Arial" w:cs="Arial"/>
+          <w:b/>
+          <w:sz w:val="20"/>
+          <w:szCs w:val="24"/>
+        </w:rPr>
+      </w:pPr>
+    </w:p>
+    <w:p>
+      <w:pPr>
+        <w:spacing w:after="0" w:line="360" w:lineRule="auto"/>
+        <w:ind w:firstLine="709"/>
+        <w:jc w:val="both"/>
+        <w:rPr>
+          <w:rFonts w:ascii="Arial" w:hAnsi="Arial" w:cs="Arial"/>
+          <w:b/>
+          <w:sz w:val="20"/>
+          <w:szCs w:val="24"/>
+        </w:rPr>
+      </w:pPr>
+    </w:p>
+    <w:p>
+      <w:pPr>
+        <w:spacing w:after="0" w:line="360" w:lineRule="auto"/>
+        <w:ind w:firstLine="709"/>
+        <w:jc w:val="both"/>
+        <w:rPr>
+          <w:rFonts w:ascii="Arial" w:hAnsi="Arial" w:cs="Arial"/>
+          <w:b/>
+          <w:sz w:val="20"/>
+          <w:szCs w:val="24"/>
+        </w:rPr>
+      </w:pPr>
+    </w:p>
+    <w:p>
+      <w:pPr>
         <w:spacing w:after="0" w:line="240" w:lineRule="auto"/>
         <w:ind w:firstLine="708"/>
         <w:jc w:val="both"/>
@@ -2716,6 +2906,7 @@
           <w:sz w:val="24"/>
           <w:szCs w:val="24"/>
         </w:rPr>
+        <w:lastRenderedPageBreak/>
         <w:t xml:space="preserve">Tabela </w:t>
       </w:r>
       <w:r>
@@ -3035,7 +3226,6 @@
               <w:rPr>
                 <w:b/>
               </w:rPr>
-              <w:lastRenderedPageBreak/>
               <w:t>CONTROLE E PRIVILÉGIOS</w:t>
             </w:r>
           </w:p>
@@ -3386,7 +3576,7 @@
                 <w:lang w:eastAsia="pt-BR"/>
               </w:rPr>
             </w:pPr>
-            <w:bookmarkStart w:id="0" w:name="RANGE!B1"/>
+            <w:bookmarkStart w:id="1" w:name="RANGE!B1"/>
             <w:r>
               <w:rPr>
                 <w:rFonts w:eastAsia="Times New Roman" w:cstheme="minorHAnsi"/>
@@ -3397,7 +3587,7 @@
               </w:rPr>
               <w:t>5. HISTÓRIAS DE USUÁRIO</w:t>
             </w:r>
-            <w:bookmarkEnd w:id="0"/>
+            <w:bookmarkEnd w:id="1"/>
           </w:p>
         </w:tc>
       </w:tr>
@@ -4249,6 +4439,7 @@
                 <w:color w:val="000000"/>
                 <w:lang w:eastAsia="pt-BR"/>
               </w:rPr>
+              <w:lastRenderedPageBreak/>
               <w:t>RF 003</w:t>
             </w:r>
           </w:p>
@@ -4463,7 +4654,7 @@
       </w:tr>
       <w:tr>
         <w:trPr>
-          <w:trHeight w:val="755"/>
+          <w:trHeight w:val="718"/>
         </w:trPr>
         <w:tc>
           <w:tcPr>
@@ -5322,19 +5513,18 @@
                 <w:lang w:eastAsia="pt-BR"/>
               </w:rPr>
             </w:pPr>
-            <w:bookmarkStart w:id="1" w:name="RANGE!B18"/>
-            <w:r>
-              <w:rPr>
-                <w:rFonts w:eastAsia="Times New Roman" w:cstheme="minorHAnsi"/>
-                <w:b/>
-                <w:bCs/>
-                <w:color w:val="000000"/>
-                <w:lang w:eastAsia="pt-BR"/>
-              </w:rPr>
-              <w:lastRenderedPageBreak/>
+            <w:bookmarkStart w:id="2" w:name="RANGE!B18"/>
+            <w:r>
+              <w:rPr>
+                <w:rFonts w:eastAsia="Times New Roman" w:cstheme="minorHAnsi"/>
+                <w:b/>
+                <w:bCs/>
+                <w:color w:val="000000"/>
+                <w:lang w:eastAsia="pt-BR"/>
+              </w:rPr>
               <w:t>RF 006</w:t>
             </w:r>
-            <w:bookmarkEnd w:id="1"/>
+            <w:bookmarkEnd w:id="2"/>
           </w:p>
         </w:tc>
         <w:tc>
@@ -5550,7 +5740,7 @@
       </w:tr>
       <w:tr>
         <w:trPr>
-          <w:trHeight w:val="636"/>
+          <w:trHeight w:val="510"/>
         </w:trPr>
         <w:tc>
           <w:tcPr>
@@ -6337,8 +6527,6 @@
               </w:rPr>
               <w:t>consiga preencher minhas informações rapidamente</w:t>
             </w:r>
-            <w:bookmarkStart w:id="2" w:name="_GoBack"/>
-            <w:bookmarkEnd w:id="2"/>
           </w:p>
         </w:tc>
       </w:tr>
@@ -7584,7 +7772,6 @@
           <w:sz w:val="24"/>
           <w:szCs w:val="24"/>
         </w:rPr>
-        <w:lastRenderedPageBreak/>
         <w:t xml:space="preserve">2 – Desenvolvimento </w:t>
       </w:r>
     </w:p>
@@ -8029,6 +8216,45 @@
       <w:pPr>
         <w:spacing w:after="0" w:line="360" w:lineRule="auto"/>
         <w:ind w:firstLine="709"/>
+        <w:jc w:val="both"/>
+        <w:rPr>
+          <w:rFonts w:ascii="Arial" w:hAnsi="Arial" w:cs="Arial"/>
+          <w:b/>
+          <w:sz w:val="24"/>
+          <w:szCs w:val="24"/>
+        </w:rPr>
+      </w:pPr>
+    </w:p>
+    <w:p>
+      <w:pPr>
+        <w:spacing w:after="0" w:line="360" w:lineRule="auto"/>
+        <w:ind w:firstLine="709"/>
+        <w:jc w:val="both"/>
+        <w:rPr>
+          <w:rFonts w:ascii="Arial" w:hAnsi="Arial" w:cs="Arial"/>
+          <w:b/>
+          <w:sz w:val="24"/>
+          <w:szCs w:val="24"/>
+        </w:rPr>
+      </w:pPr>
+    </w:p>
+    <w:p>
+      <w:pPr>
+        <w:spacing w:after="0" w:line="360" w:lineRule="auto"/>
+        <w:ind w:firstLine="709"/>
+        <w:jc w:val="both"/>
+        <w:rPr>
+          <w:rFonts w:ascii="Arial" w:hAnsi="Arial" w:cs="Arial"/>
+          <w:b/>
+          <w:sz w:val="24"/>
+          <w:szCs w:val="24"/>
+        </w:rPr>
+      </w:pPr>
+    </w:p>
+    <w:p>
+      <w:pPr>
+        <w:spacing w:after="0" w:line="360" w:lineRule="auto"/>
+        <w:ind w:firstLine="709"/>
         <w:rPr>
           <w:rFonts w:ascii="Arial" w:hAnsi="Arial" w:cs="Arial"/>
           <w:b/>
@@ -8043,6 +8269,7 @@
           <w:sz w:val="24"/>
           <w:szCs w:val="24"/>
         </w:rPr>
+        <w:lastRenderedPageBreak/>
         <w:t xml:space="preserve">6 </w:t>
       </w:r>
       <w:r>
@@ -9775,6 +10002,77 @@
               </w:rPr>
             </w:pPr>
           </w:p>
+          <w:p>
+            <w:pPr>
+              <w:spacing w:after="0" w:line="240" w:lineRule="auto"/>
+              <w:jc w:val="center"/>
+              <w:rPr>
+                <w:rFonts w:ascii="Times New Roman" w:eastAsia="Times New Roman" w:hAnsi="Times New Roman" w:cs="Times New Roman"/>
+                <w:sz w:val="20"/>
+                <w:szCs w:val="20"/>
+                <w:lang w:eastAsia="pt-BR"/>
+              </w:rPr>
+            </w:pPr>
+          </w:p>
+          <w:p>
+            <w:pPr>
+              <w:spacing w:after="0" w:line="240" w:lineRule="auto"/>
+              <w:jc w:val="center"/>
+              <w:rPr>
+                <w:rFonts w:ascii="Times New Roman" w:eastAsia="Times New Roman" w:hAnsi="Times New Roman" w:cs="Times New Roman"/>
+                <w:sz w:val="20"/>
+                <w:szCs w:val="20"/>
+                <w:lang w:eastAsia="pt-BR"/>
+              </w:rPr>
+            </w:pPr>
+          </w:p>
+          <w:p>
+            <w:pPr>
+              <w:spacing w:after="0" w:line="240" w:lineRule="auto"/>
+              <w:jc w:val="center"/>
+              <w:rPr>
+                <w:rFonts w:ascii="Times New Roman" w:eastAsia="Times New Roman" w:hAnsi="Times New Roman" w:cs="Times New Roman"/>
+                <w:sz w:val="20"/>
+                <w:szCs w:val="20"/>
+                <w:lang w:eastAsia="pt-BR"/>
+              </w:rPr>
+            </w:pPr>
+          </w:p>
+          <w:p>
+            <w:pPr>
+              <w:spacing w:after="0" w:line="240" w:lineRule="auto"/>
+              <w:jc w:val="center"/>
+              <w:rPr>
+                <w:rFonts w:ascii="Times New Roman" w:eastAsia="Times New Roman" w:hAnsi="Times New Roman" w:cs="Times New Roman"/>
+                <w:sz w:val="20"/>
+                <w:szCs w:val="20"/>
+                <w:lang w:eastAsia="pt-BR"/>
+              </w:rPr>
+            </w:pPr>
+          </w:p>
+          <w:p>
+            <w:pPr>
+              <w:spacing w:after="0" w:line="240" w:lineRule="auto"/>
+              <w:jc w:val="center"/>
+              <w:rPr>
+                <w:rFonts w:ascii="Times New Roman" w:eastAsia="Times New Roman" w:hAnsi="Times New Roman" w:cs="Times New Roman"/>
+                <w:sz w:val="20"/>
+                <w:szCs w:val="20"/>
+                <w:lang w:eastAsia="pt-BR"/>
+              </w:rPr>
+            </w:pPr>
+          </w:p>
+          <w:p>
+            <w:pPr>
+              <w:spacing w:after="0" w:line="240" w:lineRule="auto"/>
+              <w:rPr>
+                <w:rFonts w:ascii="Times New Roman" w:eastAsia="Times New Roman" w:hAnsi="Times New Roman" w:cs="Times New Roman"/>
+                <w:sz w:val="20"/>
+                <w:szCs w:val="20"/>
+                <w:lang w:eastAsia="pt-BR"/>
+              </w:rPr>
+            </w:pPr>
+          </w:p>
         </w:tc>
         <w:tc>
           <w:tcPr>
@@ -10004,7 +10302,6 @@
                 <w:color w:val="000000"/>
                 <w:lang w:eastAsia="pt-BR"/>
               </w:rPr>
-              <w:lastRenderedPageBreak/>
               <w:t>Item</w:t>
             </w:r>
           </w:p>
@@ -13651,6 +13948,32 @@
     <w:p>
       <w:pPr>
         <w:spacing w:after="0" w:line="360" w:lineRule="auto"/>
+        <w:ind w:firstLine="709"/>
+        <w:jc w:val="both"/>
+        <w:rPr>
+          <w:rFonts w:ascii="Arial" w:hAnsi="Arial" w:cs="Arial"/>
+          <w:b/>
+          <w:sz w:val="24"/>
+          <w:szCs w:val="24"/>
+        </w:rPr>
+      </w:pPr>
+    </w:p>
+    <w:p>
+      <w:pPr>
+        <w:spacing w:after="0" w:line="360" w:lineRule="auto"/>
+        <w:ind w:firstLine="709"/>
+        <w:jc w:val="both"/>
+        <w:rPr>
+          <w:rFonts w:ascii="Arial" w:hAnsi="Arial" w:cs="Arial"/>
+          <w:b/>
+          <w:sz w:val="24"/>
+          <w:szCs w:val="24"/>
+        </w:rPr>
+      </w:pPr>
+    </w:p>
+    <w:p>
+      <w:pPr>
+        <w:spacing w:after="0" w:line="360" w:lineRule="auto"/>
         <w:ind w:firstLine="708"/>
         <w:jc w:val="both"/>
         <w:rPr>
@@ -13667,6 +13990,7 @@
           <w:sz w:val="24"/>
           <w:szCs w:val="24"/>
         </w:rPr>
+        <w:lastRenderedPageBreak/>
         <w:t xml:space="preserve">7 </w:t>
       </w:r>
       <w:r>
@@ -13902,7 +14226,6 @@
           <w:sz w:val="24"/>
           <w:szCs w:val="24"/>
         </w:rPr>
-        <w:lastRenderedPageBreak/>
         <w:t>• Justificativa da escolha: É uma escolha sólida, eficaz e robusta para o desenvolvimento do projeto, sendo extremamente compatível com uma grande vastidão de softwares</w:t>
       </w:r>
     </w:p>
@@ -14536,6 +14859,7 @@
               <w:jc w:val="center"/>
             </w:pPr>
             <w:r>
+              <w:lastRenderedPageBreak/>
               <w:t>4°</w:t>
             </w:r>
           </w:p>
@@ -15335,7 +15659,6 @@
           <w:sz w:val="24"/>
           <w:szCs w:val="24"/>
         </w:rPr>
-        <w:lastRenderedPageBreak/>
         <w:t xml:space="preserve">9 </w:t>
       </w:r>
       <w:r>
@@ -17350,6 +17673,7 @@
           <w:sz w:val="24"/>
           <w:szCs w:val="24"/>
         </w:rPr>
+        <w:lastRenderedPageBreak/>
         <w:t xml:space="preserve">10 </w:t>
       </w:r>
       <w:r>
@@ -18474,7 +18798,7 @@
   <w:style w:type="paragraph" w:default="1" w:styleId="Normal">
     <w:name w:val="Normal"/>
     <w:qFormat/>
-    <w:rsid w:val="008045AD"/>
+    <w:rsid w:val="000E77CA"/>
   </w:style>
   <w:style w:type="character" w:default="1" w:styleId="Fontepargpadro">
     <w:name w:val="Default Paragraph Font"/>
@@ -20012,7 +20336,7 @@
 </file>
 
 <file path=customXml/itemProps1.xml><?xml version="1.0" encoding="utf-8"?>
-<ds:datastoreItem xmlns:ds="http://schemas.openxmlformats.org/officeDocument/2006/customXml" ds:itemID="{145E4385-E824-43A5-97A6-021967ED376F}">
+<ds:datastoreItem xmlns:ds="http://schemas.openxmlformats.org/officeDocument/2006/customXml" ds:itemID="{D1EE6DEF-7631-472F-ACE2-785A561E9780}">
   <ds:schemaRefs>
     <ds:schemaRef ds:uri="http://schemas.openxmlformats.org/officeDocument/2006/bibliography"/>
   </ds:schemaRefs>

</xml_diff>